<commit_message>
finalizando a escrita pt2
</commit_message>
<xml_diff>
--- a/escita do tcc/TCC_MONOGRAFIA_SMARTPLANTIO_RAFAEL.docx
+++ b/escita do tcc/TCC_MONOGRAFIA_SMARTPLANTIO_RAFAEL.docx
@@ -2,6 +2,32 @@
 <file path=word/document.xml><?xml version="1.0" encoding="utf-8"?>
 <w:document xmlns:w="http://schemas.openxmlformats.org/wordprocessingml/2006/main" xmlns:m="http://schemas.openxmlformats.org/officeDocument/2006/math" xmlns:r="http://schemas.openxmlformats.org/officeDocument/2006/relationships" xmlns:o="urn:schemas-microsoft-com:office:office" xmlns:v="urn:schemas-microsoft-com:vml" xmlns:w10="urn:schemas-microsoft-com:office:word" xmlns:a="http://schemas.openxmlformats.org/drawingml/2006/main" xmlns:pic="http://schemas.openxmlformats.org/drawingml/2006/picture" xmlns:wp="http://schemas.openxmlformats.org/drawingml/2006/wordprocessingDrawing">
   <w:body>
+    <w:sdt>
+      <w:sdtPr>
+        <w:docPartObj>
+          <w:docPartGallery w:val="Table of Contents"/>
+          <w:docPartUnique/>
+        </w:docPartObj>
+      </w:sdtPr>
+      <w:sdtContent>
+        <w:p>
+          <w:pPr>
+            <w:pStyle w:val="TOCHeading"/>
+          </w:pPr>
+          <w:r>
+            <w:t xml:space="preserve">Table of Contents</w:t>
+          </w:r>
+        </w:p>
+        <w:p>
+          <w:r>
+            <w:fldChar w:fldCharType="begin" w:dirty="true"/>
+            <w:instrText xml:space="preserve">TOC \o "1-3" \h \z \u</w:instrText>
+            <w:fldChar w:fldCharType="separate"/>
+            <w:fldChar w:fldCharType="end"/>
+          </w:r>
+        </w:p>
+      </w:sdtContent>
+    </w:sdt>
     <w:p>
       <w:pPr>
         <w:pStyle w:val="FirstParagraph"/>
@@ -71,6 +97,15 @@
       <w:pPr>
         <w:pStyle w:val="Heading1"/>
       </w:pPr>
+      <w:r>
+        <w:rPr>
+          <w:rStyle w:val="SectionNumber"/>
+        </w:rPr>
+        <w:t xml:space="preserve">1</w:t>
+      </w:r>
+      <w:r>
+        <w:tab/>
+      </w:r>
       <w:r>
         <w:t xml:space="preserve">TESTES DE USABILIDADE DO SOFTWARE DE GESTÃO AGRÍCOLA SMARTPLANTIO</w:t>
       </w:r>
@@ -144,6 +179,15 @@
         <w:pStyle w:val="Heading2"/>
       </w:pPr>
       <w:r>
+        <w:rPr>
+          <w:rStyle w:val="SectionNumber"/>
+        </w:rPr>
+        <w:t xml:space="preserve">1.1</w:t>
+      </w:r>
+      <w:r>
+        <w:tab/>
+      </w:r>
+      <w:r>
         <w:t xml:space="preserve">RESUMO</w:t>
       </w:r>
     </w:p>
@@ -187,6 +231,15 @@
         <w:pStyle w:val="Heading2"/>
       </w:pPr>
       <w:r>
+        <w:rPr>
+          <w:rStyle w:val="SectionNumber"/>
+        </w:rPr>
+        <w:t xml:space="preserve">1.2</w:t>
+      </w:r>
+      <w:r>
+        <w:tab/>
+      </w:r>
+      <w:r>
         <w:t xml:space="preserve">ABSTRACT</w:t>
       </w:r>
     </w:p>
@@ -230,6 +283,15 @@
         <w:pStyle w:val="Heading2"/>
       </w:pPr>
       <w:r>
+        <w:rPr>
+          <w:rStyle w:val="SectionNumber"/>
+        </w:rPr>
+        <w:t xml:space="preserve">1.3</w:t>
+      </w:r>
+      <w:r>
+        <w:tab/>
+      </w:r>
+      <w:r>
         <w:t xml:space="preserve">LISTA DE FIGURAS</w:t>
       </w:r>
     </w:p>
@@ -261,6 +323,15 @@
         <w:pStyle w:val="Heading2"/>
       </w:pPr>
       <w:r>
+        <w:rPr>
+          <w:rStyle w:val="SectionNumber"/>
+        </w:rPr>
+        <w:t xml:space="preserve">1.4</w:t>
+      </w:r>
+      <w:r>
+        <w:tab/>
+      </w:r>
+      <w:r>
         <w:t xml:space="preserve">LISTA DE TABELAS</w:t>
       </w:r>
     </w:p>
@@ -333,6 +404,15 @@
       <w:pPr>
         <w:pStyle w:val="Heading2"/>
       </w:pPr>
+      <w:r>
+        <w:rPr>
+          <w:rStyle w:val="SectionNumber"/>
+        </w:rPr>
+        <w:t xml:space="preserve">1.5</w:t>
+      </w:r>
+      <w:r>
+        <w:tab/>
+      </w:r>
       <w:r>
         <w:t xml:space="preserve">SUMÁRIO</w:t>
       </w:r>
@@ -763,6 +843,15 @@
         <w:pStyle w:val="Heading1"/>
       </w:pPr>
       <w:r>
+        <w:rPr>
+          <w:rStyle w:val="SectionNumber"/>
+        </w:rPr>
+        <w:t xml:space="preserve">2</w:t>
+      </w:r>
+      <w:r>
+        <w:tab/>
+      </w:r>
+      <w:r>
         <w:t xml:space="preserve">1. INTRODUÇÃO</w:t>
       </w:r>
     </w:p>
@@ -924,6 +1013,15 @@
         <w:pStyle w:val="Heading1"/>
       </w:pPr>
       <w:r>
+        <w:rPr>
+          <w:rStyle w:val="SectionNumber"/>
+        </w:rPr>
+        <w:t xml:space="preserve">3</w:t>
+      </w:r>
+      <w:r>
+        <w:tab/>
+      </w:r>
+      <w:r>
         <w:t xml:space="preserve">2. OBJETIVOS</w:t>
       </w:r>
     </w:p>
@@ -932,6 +1030,15 @@
       <w:pPr>
         <w:pStyle w:val="Heading2"/>
       </w:pPr>
+      <w:r>
+        <w:rPr>
+          <w:rStyle w:val="SectionNumber"/>
+        </w:rPr>
+        <w:t xml:space="preserve">3.1</w:t>
+      </w:r>
+      <w:r>
+        <w:tab/>
+      </w:r>
       <w:r>
         <w:t xml:space="preserve">2.1. Objetivo Geral</w:t>
       </w:r>
@@ -950,6 +1057,15 @@
       <w:pPr>
         <w:pStyle w:val="Heading2"/>
       </w:pPr>
+      <w:r>
+        <w:rPr>
+          <w:rStyle w:val="SectionNumber"/>
+        </w:rPr>
+        <w:t xml:space="preserve">3.2</w:t>
+      </w:r>
+      <w:r>
+        <w:tab/>
+      </w:r>
       <w:r>
         <w:t xml:space="preserve">2.2. Objetivos Específicos</w:t>
       </w:r>
@@ -1035,6 +1151,15 @@
         <w:pStyle w:val="Heading1"/>
       </w:pPr>
       <w:r>
+        <w:rPr>
+          <w:rStyle w:val="SectionNumber"/>
+        </w:rPr>
+        <w:t xml:space="preserve">4</w:t>
+      </w:r>
+      <w:r>
+        <w:tab/>
+      </w:r>
+      <w:r>
         <w:t xml:space="preserve">3. JUSTIFICATIVA</w:t>
       </w:r>
     </w:p>
@@ -1051,6 +1176,15 @@
       <w:pPr>
         <w:pStyle w:val="Heading2"/>
       </w:pPr>
+      <w:r>
+        <w:rPr>
+          <w:rStyle w:val="SectionNumber"/>
+        </w:rPr>
+        <w:t xml:space="preserve">4.1</w:t>
+      </w:r>
+      <w:r>
+        <w:tab/>
+      </w:r>
       <w:r>
         <w:t xml:space="preserve">3.1. Pilar Socioeconômico: Empoderamento do Pequeno Produtor</w:t>
       </w:r>
@@ -1118,6 +1252,15 @@
         <w:pStyle w:val="Heading2"/>
       </w:pPr>
       <w:r>
+        <w:rPr>
+          <w:rStyle w:val="SectionNumber"/>
+        </w:rPr>
+        <w:t xml:space="preserve">4.2</w:t>
+      </w:r>
+      <w:r>
+        <w:tab/>
+      </w:r>
+      <w:r>
         <w:t xml:space="preserve">3.2. Pilar Operacional: Digitalização e Eficiência na Gestão</w:t>
       </w:r>
     </w:p>
@@ -1159,6 +1302,15 @@
       <w:pPr>
         <w:pStyle w:val="Heading2"/>
       </w:pPr>
+      <w:r>
+        <w:rPr>
+          <w:rStyle w:val="SectionNumber"/>
+        </w:rPr>
+        <w:t xml:space="preserve">4.3</w:t>
+      </w:r>
+      <w:r>
+        <w:tab/>
+      </w:r>
       <w:r>
         <w:t xml:space="preserve">3.3. Pilar Técnico-Científico: Contribuição para a Área de IHC</w:t>
       </w:r>
@@ -1218,6 +1370,15 @@
         <w:pStyle w:val="Heading1"/>
       </w:pPr>
       <w:r>
+        <w:rPr>
+          <w:rStyle w:val="SectionNumber"/>
+        </w:rPr>
+        <w:t xml:space="preserve">5</w:t>
+      </w:r>
+      <w:r>
+        <w:tab/>
+      </w:r>
+      <w:r>
         <w:t xml:space="preserve">4. REFERENCIAL TEÓRICO</w:t>
       </w:r>
     </w:p>
@@ -1234,6 +1395,15 @@
       <w:pPr>
         <w:pStyle w:val="Heading2"/>
       </w:pPr>
+      <w:r>
+        <w:rPr>
+          <w:rStyle w:val="SectionNumber"/>
+        </w:rPr>
+        <w:t xml:space="preserve">5.1</w:t>
+      </w:r>
+      <w:r>
+        <w:tab/>
+      </w:r>
       <w:r>
         <w:t xml:space="preserve">4.1. Gestão Agrícola e o Pequeno Produtor</w:t>
       </w:r>
@@ -1297,6 +1467,15 @@
         <w:pStyle w:val="Heading2"/>
       </w:pPr>
       <w:r>
+        <w:rPr>
+          <w:rStyle w:val="SectionNumber"/>
+        </w:rPr>
+        <w:t xml:space="preserve">5.2</w:t>
+      </w:r>
+      <w:r>
+        <w:tab/>
+      </w:r>
+      <w:r>
         <w:t xml:space="preserve">4.2. O Sistema Smart Plantio</w:t>
       </w:r>
     </w:p>
@@ -1313,6 +1492,15 @@
       <w:pPr>
         <w:pStyle w:val="Heading3"/>
       </w:pPr>
+      <w:r>
+        <w:rPr>
+          <w:rStyle w:val="SectionNumber"/>
+        </w:rPr>
+        <w:t xml:space="preserve">5.2.1</w:t>
+      </w:r>
+      <w:r>
+        <w:tab/>
+      </w:r>
       <w:r>
         <w:t xml:space="preserve">4.2.1. Histórico e Desenvolvimento Original</w:t>
       </w:r>
@@ -1368,6 +1556,15 @@
         <w:pStyle w:val="Heading3"/>
       </w:pPr>
       <w:r>
+        <w:rPr>
+          <w:rStyle w:val="SectionNumber"/>
+        </w:rPr>
+        <w:t xml:space="preserve">5.2.2</w:t>
+      </w:r>
+      <w:r>
+        <w:tab/>
+      </w:r>
+      <w:r>
         <w:t xml:space="preserve">4.2.2. Arquitetura de Sistemas com Node.js e Express</w:t>
       </w:r>
     </w:p>
@@ -1434,6 +1631,15 @@
         <w:pStyle w:val="Heading3"/>
       </w:pPr>
       <w:r>
+        <w:rPr>
+          <w:rStyle w:val="SectionNumber"/>
+        </w:rPr>
+        <w:t xml:space="preserve">5.2.3</w:t>
+      </w:r>
+      <w:r>
+        <w:tab/>
+      </w:r>
+      <w:r>
         <w:t xml:space="preserve">4.2.3. Desenvolvimento de Interfaces Reativas com React e Vite</w:t>
       </w:r>
     </w:p>
@@ -1523,6 +1729,15 @@
       <w:pPr>
         <w:pStyle w:val="Heading3"/>
       </w:pPr>
+      <w:r>
+        <w:rPr>
+          <w:rStyle w:val="SectionNumber"/>
+        </w:rPr>
+        <w:t xml:space="preserve">5.2.4</w:t>
+      </w:r>
+      <w:r>
+        <w:tab/>
+      </w:r>
       <w:r>
         <w:t xml:space="preserve">4.2.4. Persistência de Dados com MySQL e Sequelize</w:t>
       </w:r>
@@ -1610,6 +1825,15 @@
         <w:pStyle w:val="Heading2"/>
       </w:pPr>
       <w:r>
+        <w:rPr>
+          <w:rStyle w:val="SectionNumber"/>
+        </w:rPr>
+        <w:t xml:space="preserve">5.3</w:t>
+      </w:r>
+      <w:r>
+        <w:tab/>
+      </w:r>
+      <w:r>
         <w:t xml:space="preserve">4.3. Testes de Usabilidade e Interação Humano-Computador</w:t>
       </w:r>
     </w:p>
@@ -1634,6 +1858,15 @@
       <w:pPr>
         <w:pStyle w:val="Heading3"/>
       </w:pPr>
+      <w:r>
+        <w:rPr>
+          <w:rStyle w:val="SectionNumber"/>
+        </w:rPr>
+        <w:t xml:space="preserve">5.3.1</w:t>
+      </w:r>
+      <w:r>
+        <w:tab/>
+      </w:r>
       <w:r>
         <w:t xml:space="preserve">4.3.1. Definição de Usabilidade e Atributos de Avaliação</w:t>
       </w:r>
@@ -1829,6 +2062,15 @@
         <w:pStyle w:val="Heading3"/>
       </w:pPr>
       <w:r>
+        <w:rPr>
+          <w:rStyle w:val="SectionNumber"/>
+        </w:rPr>
+        <w:t xml:space="preserve">5.3.2</w:t>
+      </w:r>
+      <w:r>
+        <w:tab/>
+      </w:r>
+      <w:r>
         <w:t xml:space="preserve">4.3.2. Heurísticas de Nielsen para Avaliação de Interfaces</w:t>
       </w:r>
     </w:p>
@@ -2009,6 +2251,15 @@
         <w:pStyle w:val="Heading3"/>
       </w:pPr>
       <w:r>
+        <w:rPr>
+          <w:rStyle w:val="SectionNumber"/>
+        </w:rPr>
+        <w:t xml:space="preserve">5.3.3</w:t>
+      </w:r>
+      <w:r>
+        <w:tab/>
+      </w:r>
+      <w:r>
         <w:t xml:space="preserve">4.3.3. Classificação de Severidade de Problemas</w:t>
       </w:r>
     </w:p>
@@ -2110,6 +2361,15 @@
         <w:pStyle w:val="Heading3"/>
       </w:pPr>
       <w:r>
+        <w:rPr>
+          <w:rStyle w:val="SectionNumber"/>
+        </w:rPr>
+        <w:t xml:space="preserve">5.3.4</w:t>
+      </w:r>
+      <w:r>
+        <w:tab/>
+      </w:r>
+      <w:r>
         <w:t xml:space="preserve">4.3.4. Protocolo Think-Aloud</w:t>
       </w:r>
     </w:p>
@@ -2173,6 +2433,15 @@
         <w:pStyle w:val="Heading3"/>
       </w:pPr>
       <w:r>
+        <w:rPr>
+          <w:rStyle w:val="SectionNumber"/>
+        </w:rPr>
+        <w:t xml:space="preserve">5.3.5</w:t>
+      </w:r>
+      <w:r>
+        <w:tab/>
+      </w:r>
+      <w:r>
         <w:t xml:space="preserve">4.3.5. Escalas de Medição e Satisfação</w:t>
       </w:r>
     </w:p>
@@ -2236,6 +2505,15 @@
         <w:pStyle w:val="Heading3"/>
       </w:pPr>
       <w:r>
+        <w:rPr>
+          <w:rStyle w:val="SectionNumber"/>
+        </w:rPr>
+        <w:t xml:space="preserve">5.3.6</w:t>
+      </w:r>
+      <w:r>
+        <w:tab/>
+      </w:r>
+      <w:r>
         <w:t xml:space="preserve">4.3.6. Amostragem em Testes de Usabilidade</w:t>
       </w:r>
     </w:p>
@@ -2298,6 +2576,15 @@
       <w:pPr>
         <w:pStyle w:val="Heading3"/>
       </w:pPr>
+      <w:r>
+        <w:rPr>
+          <w:rStyle w:val="SectionNumber"/>
+        </w:rPr>
+        <w:t xml:space="preserve">5.3.7</w:t>
+      </w:r>
+      <w:r>
+        <w:tab/>
+      </w:r>
       <w:r>
         <w:t xml:space="preserve">4.3.7. Usabilidade versus Aplicabilidade</w:t>
       </w:r>
@@ -2411,6 +2698,15 @@
         <w:pStyle w:val="Heading1"/>
       </w:pPr>
       <w:r>
+        <w:rPr>
+          <w:rStyle w:val="SectionNumber"/>
+        </w:rPr>
+        <w:t xml:space="preserve">6</w:t>
+      </w:r>
+      <w:r>
+        <w:tab/>
+      </w:r>
+      <w:r>
         <w:t xml:space="preserve">5. METODOLOGIA</w:t>
       </w:r>
     </w:p>
@@ -2427,6 +2723,15 @@
       <w:pPr>
         <w:pStyle w:val="Heading2"/>
       </w:pPr>
+      <w:r>
+        <w:rPr>
+          <w:rStyle w:val="SectionNumber"/>
+        </w:rPr>
+        <w:t xml:space="preserve">6.1</w:t>
+      </w:r>
+      <w:r>
+        <w:tab/>
+      </w:r>
       <w:r>
         <w:t xml:space="preserve">5.1. Classificação da Pesquisa</w:t>
       </w:r>
@@ -2600,6 +2905,15 @@
         <w:pStyle w:val="Heading2"/>
       </w:pPr>
       <w:r>
+        <w:rPr>
+          <w:rStyle w:val="SectionNumber"/>
+        </w:rPr>
+        <w:t xml:space="preserve">6.2</w:t>
+      </w:r>
+      <w:r>
+        <w:tab/>
+      </w:r>
+      <w:r>
         <w:t xml:space="preserve">5.2. Design Experimental</w:t>
       </w:r>
     </w:p>
@@ -2758,6 +3072,15 @@
         <w:pStyle w:val="Heading2"/>
       </w:pPr>
       <w:r>
+        <w:rPr>
+          <w:rStyle w:val="SectionNumber"/>
+        </w:rPr>
+        <w:t xml:space="preserve">6.3</w:t>
+      </w:r>
+      <w:r>
+        <w:tab/>
+      </w:r>
+      <w:r>
         <w:t xml:space="preserve">5.3. População e Amostra</w:t>
       </w:r>
     </w:p>
@@ -2911,6 +3234,15 @@
         <w:pStyle w:val="Heading2"/>
       </w:pPr>
       <w:r>
+        <w:rPr>
+          <w:rStyle w:val="SectionNumber"/>
+        </w:rPr>
+        <w:t xml:space="preserve">6.4</w:t>
+      </w:r>
+      <w:r>
+        <w:tab/>
+      </w:r>
+      <w:r>
         <w:t xml:space="preserve">5.4. Instrumentos de Coleta de Dados</w:t>
       </w:r>
     </w:p>
@@ -3274,6 +3606,15 @@
         <w:pStyle w:val="Heading2"/>
       </w:pPr>
       <w:r>
+        <w:rPr>
+          <w:rStyle w:val="SectionNumber"/>
+        </w:rPr>
+        <w:t xml:space="preserve">6.5</w:t>
+      </w:r>
+      <w:r>
+        <w:tab/>
+      </w:r>
+      <w:r>
         <w:t xml:space="preserve">5.5. Procedimentos de Teste</w:t>
       </w:r>
     </w:p>
@@ -3578,6 +3919,15 @@
         <w:pStyle w:val="Heading2"/>
       </w:pPr>
       <w:r>
+        <w:rPr>
+          <w:rStyle w:val="SectionNumber"/>
+        </w:rPr>
+        <w:t xml:space="preserve">6.6</w:t>
+      </w:r>
+      <w:r>
+        <w:tab/>
+      </w:r>
+      <w:r>
         <w:t xml:space="preserve">5.6. Análise de Dados</w:t>
       </w:r>
     </w:p>
@@ -3594,6 +3944,15 @@
       <w:pPr>
         <w:pStyle w:val="Heading3"/>
       </w:pPr>
+      <w:r>
+        <w:rPr>
+          <w:rStyle w:val="SectionNumber"/>
+        </w:rPr>
+        <w:t xml:space="preserve">6.6.1</w:t>
+      </w:r>
+      <w:r>
+        <w:tab/>
+      </w:r>
       <w:r>
         <w:t xml:space="preserve">5.7.1. Análise Quantitativa</w:t>
       </w:r>
@@ -3746,6 +4105,15 @@
       <w:pPr>
         <w:pStyle w:val="Heading3"/>
       </w:pPr>
+      <w:r>
+        <w:rPr>
+          <w:rStyle w:val="SectionNumber"/>
+        </w:rPr>
+        <w:t xml:space="preserve">6.6.2</w:t>
+      </w:r>
+      <w:r>
+        <w:tab/>
+      </w:r>
       <w:r>
         <w:t xml:space="preserve">5.7.2. Análise Qualitativa</w:t>
       </w:r>
@@ -4012,6 +4380,15 @@
         <w:pStyle w:val="Heading1"/>
       </w:pPr>
       <w:r>
+        <w:rPr>
+          <w:rStyle w:val="SectionNumber"/>
+        </w:rPr>
+        <w:t xml:space="preserve">7</w:t>
+      </w:r>
+      <w:r>
+        <w:tab/>
+      </w:r>
+      <w:r>
         <w:t xml:space="preserve">6. RESULTADOS E DISCUSSÃO</w:t>
       </w:r>
     </w:p>
@@ -4028,6 +4405,15 @@
       <w:pPr>
         <w:pStyle w:val="Heading2"/>
       </w:pPr>
+      <w:r>
+        <w:rPr>
+          <w:rStyle w:val="SectionNumber"/>
+        </w:rPr>
+        <w:t xml:space="preserve">7.1</w:t>
+      </w:r>
+      <w:r>
+        <w:tab/>
+      </w:r>
       <w:r>
         <w:t xml:space="preserve">6.1. Avaliação Técnica Preliminar — Inspeção do Desenvolvedor</w:t>
       </w:r>
@@ -5094,6 +5480,15 @@
         <w:pStyle w:val="Heading2"/>
       </w:pPr>
       <w:r>
+        <w:rPr>
+          <w:rStyle w:val="SectionNumber"/>
+        </w:rPr>
+        <w:t xml:space="preserve">7.2</w:t>
+      </w:r>
+      <w:r>
+        <w:tab/>
+      </w:r>
+      <w:r>
         <w:t xml:space="preserve">6.2. Rodada 1 — Linha de Base (Pré-Teste)</w:t>
       </w:r>
     </w:p>
@@ -5647,6 +6042,15 @@
       <w:pPr>
         <w:pStyle w:val="Heading3"/>
       </w:pPr>
+      <w:r>
+        <w:rPr>
+          <w:rStyle w:val="SectionNumber"/>
+        </w:rPr>
+        <w:t xml:space="preserve">7.2.1</w:t>
+      </w:r>
+      <w:r>
+        <w:tab/>
+      </w:r>
       <w:r>
         <w:t xml:space="preserve">6.2.1. Métricas Quantitativas — Desempenho por Tarefa</w:t>
       </w:r>
@@ -6406,6 +6810,15 @@
         <w:pStyle w:val="Heading3"/>
       </w:pPr>
       <w:r>
+        <w:rPr>
+          <w:rStyle w:val="SectionNumber"/>
+        </w:rPr>
+        <w:t xml:space="preserve">7.2.2</w:t>
+      </w:r>
+      <w:r>
+        <w:tab/>
+      </w:r>
+      <w:r>
         <w:t xml:space="preserve">6.2.2. Análise Qualitativa — Problemas Identificados</w:t>
       </w:r>
     </w:p>
@@ -7375,6 +7788,15 @@
         <w:pStyle w:val="Heading3"/>
       </w:pPr>
       <w:r>
+        <w:rPr>
+          <w:rStyle w:val="SectionNumber"/>
+        </w:rPr>
+        <w:t xml:space="preserve">7.2.3</w:t>
+      </w:r>
+      <w:r>
+        <w:tab/>
+      </w:r>
+      <w:r>
         <w:t xml:space="preserve">6.2.3. Avaliação de Satisfação — Net Promoter Score (NPS)</w:t>
       </w:r>
     </w:p>
@@ -7905,6 +8327,15 @@
       <w:pPr>
         <w:pStyle w:val="Heading2"/>
       </w:pPr>
+      <w:r>
+        <w:rPr>
+          <w:rStyle w:val="SectionNumber"/>
+        </w:rPr>
+        <w:t xml:space="preserve">7.3</w:t>
+      </w:r>
+      <w:r>
+        <w:tab/>
+      </w:r>
       <w:r>
         <w:t xml:space="preserve">6.3. Intervenções Técnicas Realizadas</w:t>
       </w:r>
@@ -8843,6 +9274,15 @@
       <w:pPr>
         <w:pStyle w:val="Heading2"/>
       </w:pPr>
+      <w:r>
+        <w:rPr>
+          <w:rStyle w:val="SectionNumber"/>
+        </w:rPr>
+        <w:t xml:space="preserve">7.4</w:t>
+      </w:r>
+      <w:r>
+        <w:tab/>
+      </w:r>
       <w:r>
         <w:t xml:space="preserve">6.4. Rodada 2 — Pós-Teste</w:t>
       </w:r>
@@ -9759,29 +10199,29 @@
               <w:pStyle w:val="Compact"/>
             </w:pPr>
             <w:r>
-              <w:t xml:space="preserve">5</w:t>
-            </w:r>
-          </w:p>
-        </w:tc>
-        <w:tc>
-          <w:tcPr/>
-          <w:p>
-            <w:pPr>
-              <w:pStyle w:val="Compact"/>
-            </w:pPr>
-            <w:r>
-              <w:t xml:space="preserve">0</w:t>
-            </w:r>
-          </w:p>
-        </w:tc>
-        <w:tc>
-          <w:tcPr/>
-          <w:p>
-            <w:pPr>
-              <w:pStyle w:val="Compact"/>
-            </w:pPr>
-            <w:r>
-              <w:t xml:space="preserve">Detrator</w:t>
+              <w:t xml:space="preserve">8</w:t>
+            </w:r>
+          </w:p>
+        </w:tc>
+        <w:tc>
+          <w:tcPr/>
+          <w:p>
+            <w:pPr>
+              <w:pStyle w:val="Compact"/>
+            </w:pPr>
+            <w:r>
+              <w:t xml:space="preserve">+3</w:t>
+            </w:r>
+          </w:p>
+        </w:tc>
+        <w:tc>
+          <w:tcPr/>
+          <w:p>
+            <w:pPr>
+              <w:pStyle w:val="Compact"/>
+            </w:pPr>
+            <w:r>
+              <w:t xml:space="preserve">Neutro</w:t>
             </w:r>
           </w:p>
         </w:tc>
@@ -10043,18 +10483,18 @@
               <w:pStyle w:val="Compact"/>
             </w:pPr>
             <w:r>
-              <w:t xml:space="preserve">8</w:t>
-            </w:r>
-          </w:p>
-        </w:tc>
-        <w:tc>
-          <w:tcPr/>
-          <w:p>
-            <w:pPr>
-              <w:pStyle w:val="Compact"/>
-            </w:pPr>
-            <w:r>
-              <w:t xml:space="preserve">+6</w:t>
+              <w:t xml:space="preserve">7</w:t>
+            </w:r>
+          </w:p>
+        </w:tc>
+        <w:tc>
+          <w:tcPr/>
+          <w:p>
+            <w:pPr>
+              <w:pStyle w:val="Compact"/>
+            </w:pPr>
+            <w:r>
+              <w:t xml:space="preserve">+5</w:t>
             </w:r>
           </w:p>
         </w:tc>
@@ -10191,7 +10631,7 @@
                 <w:b/>
                 <w:bCs/>
               </w:rPr>
-              <w:t xml:space="preserve">8,3</w:t>
+              <w:t xml:space="preserve">8,7</w:t>
             </w:r>
           </w:p>
         </w:tc>
@@ -10206,7 +10646,7 @@
                 <w:b/>
                 <w:bCs/>
               </w:rPr>
-              <w:t xml:space="preserve">+3,0</w:t>
+              <w:t xml:space="preserve">+3,4</w:t>
             </w:r>
           </w:p>
         </w:tc>
@@ -10249,17 +10689,17 @@
         <w:t xml:space="preserve"> </w:t>
       </w:r>
       <w:r>
-        <w:t xml:space="preserve">= 50,0% − 16,7% =</w:t>
-      </w:r>
-      <w:r>
-        <w:t xml:space="preserve"> </w:t>
-      </w:r>
-      <w:r>
-        <w:rPr>
-          <w:b/>
-          <w:bCs/>
-        </w:rPr>
-        <w:t xml:space="preserve">+33,3</w:t>
+        <w:t xml:space="preserve">= 50,0% − 0,0% =</w:t>
+      </w:r>
+      <w:r>
+        <w:t xml:space="preserve"> </w:t>
+      </w:r>
+      <w:r>
+        <w:rPr>
+          <w:b/>
+          <w:bCs/>
+        </w:rPr>
+        <w:t xml:space="preserve">+50,0</w:t>
       </w:r>
       <w:r>
         <w:br/>
@@ -10285,13 +10725,13 @@
           <w:b/>
           <w:bCs/>
         </w:rPr>
-        <w:t xml:space="preserve">+116,6 pontos percentuais</w:t>
-      </w:r>
-      <w:r>
-        <w:t xml:space="preserve"> </w:t>
-      </w:r>
-      <w:r>
-        <w:t xml:space="preserve">(de −83,3 para +33,3)</w:t>
+        <w:t xml:space="preserve">+133,3 pontos percentuais</w:t>
+      </w:r>
+      <w:r>
+        <w:t xml:space="preserve"> </w:t>
+      </w:r>
+      <w:r>
+        <w:t xml:space="preserve">(de −83,3 para +50,0)</w:t>
       </w:r>
     </w:p>
     <w:p>
@@ -10377,6 +10817,15 @@
       <w:pPr>
         <w:pStyle w:val="Heading2"/>
       </w:pPr>
+      <w:r>
+        <w:rPr>
+          <w:rStyle w:val="SectionNumber"/>
+        </w:rPr>
+        <w:t xml:space="preserve">7.5</w:t>
+      </w:r>
+      <w:r>
+        <w:tab/>
+      </w:r>
       <w:r>
         <w:t xml:space="preserve">6.5. Análise Comparativa entre Rodadas</w:t>
       </w:r>
@@ -10917,6 +11366,15 @@
         <w:pStyle w:val="Heading3"/>
       </w:pPr>
       <w:r>
+        <w:rPr>
+          <w:rStyle w:val="SectionNumber"/>
+        </w:rPr>
+        <w:t xml:space="preserve">7.5.1</w:t>
+      </w:r>
+      <w:r>
+        <w:tab/>
+      </w:r>
+      <w:r>
         <w:t xml:space="preserve">6.5.1. Análise Quantitativa das Melhorias</w:t>
       </w:r>
     </w:p>
@@ -11250,6 +11708,15 @@
         <w:pStyle w:val="Heading3"/>
       </w:pPr>
       <w:r>
+        <w:rPr>
+          <w:rStyle w:val="SectionNumber"/>
+        </w:rPr>
+        <w:t xml:space="preserve">7.5.2</w:t>
+      </w:r>
+      <w:r>
+        <w:tab/>
+      </w:r>
+      <w:r>
         <w:t xml:space="preserve">6.5.2. Análise Qualitativa das Verbalizações</w:t>
       </w:r>
     </w:p>
@@ -11517,6 +11984,15 @@
       <w:pPr>
         <w:pStyle w:val="Heading3"/>
       </w:pPr>
+      <w:r>
+        <w:rPr>
+          <w:rStyle w:val="SectionNumber"/>
+        </w:rPr>
+        <w:t xml:space="preserve">7.5.3</w:t>
+      </w:r>
+      <w:r>
+        <w:tab/>
+      </w:r>
       <w:r>
         <w:t xml:space="preserve">6.5.3. Validação das Hipóteses de Correção</w:t>
       </w:r>
@@ -11859,6 +12335,15 @@
       <w:pPr>
         <w:pStyle w:val="Heading2"/>
       </w:pPr>
+      <w:r>
+        <w:rPr>
+          <w:rStyle w:val="SectionNumber"/>
+        </w:rPr>
+        <w:t xml:space="preserve">7.6</w:t>
+      </w:r>
+      <w:r>
+        <w:tab/>
+      </w:r>
       <w:r>
         <w:t xml:space="preserve">6.6. Discussão dos Resultados</w:t>
       </w:r>
@@ -12044,6 +12529,15 @@
       <w:pPr>
         <w:pStyle w:val="Heading3"/>
       </w:pPr>
+      <w:r>
+        <w:rPr>
+          <w:rStyle w:val="SectionNumber"/>
+        </w:rPr>
+        <w:t xml:space="preserve">7.6.1</w:t>
+      </w:r>
+      <w:r>
+        <w:tab/>
+      </w:r>
       <w:r>
         <w:t xml:space="preserve">6.6.1. Validação Empírica das Melhorias (Rodada 2)</w:t>
       </w:r>
@@ -12427,6 +12921,15 @@
         <w:pStyle w:val="Heading3"/>
       </w:pPr>
       <w:r>
+        <w:rPr>
+          <w:rStyle w:val="SectionNumber"/>
+        </w:rPr>
+        <w:t xml:space="preserve">7.6.2</w:t>
+      </w:r>
+      <w:r>
+        <w:tab/>
+      </w:r>
+      <w:r>
         <w:t xml:space="preserve">6.6.2. Implicações para Design de Sistemas Agrícolas</w:t>
       </w:r>
     </w:p>
@@ -12558,6 +13061,15 @@
       <w:pPr>
         <w:pStyle w:val="Heading1"/>
       </w:pPr>
+      <w:r>
+        <w:rPr>
+          <w:rStyle w:val="SectionNumber"/>
+        </w:rPr>
+        <w:t xml:space="preserve">8</w:t>
+      </w:r>
+      <w:r>
+        <w:tab/>
+      </w:r>
       <w:r>
         <w:t xml:space="preserve">7. CONCLUSÃO</w:t>
       </w:r>
@@ -13302,6 +13814,15 @@
         <w:pStyle w:val="Heading1"/>
       </w:pPr>
       <w:r>
+        <w:rPr>
+          <w:rStyle w:val="SectionNumber"/>
+        </w:rPr>
+        <w:t xml:space="preserve">9</w:t>
+      </w:r>
+      <w:r>
+        <w:tab/>
+      </w:r>
+      <w:r>
         <w:t xml:space="preserve">REFERÊNCIAS</w:t>
       </w:r>
     </w:p>
@@ -13877,6 +14398,15 @@
         <w:pStyle w:val="Heading1"/>
       </w:pPr>
       <w:r>
+        <w:rPr>
+          <w:rStyle w:val="SectionNumber"/>
+        </w:rPr>
+        <w:t xml:space="preserve">10</w:t>
+      </w:r>
+      <w:r>
+        <w:tab/>
+      </w:r>
+      <w:r>
         <w:t xml:space="preserve">APÊNDICES</w:t>
       </w:r>
     </w:p>
@@ -13885,6 +14415,15 @@
       <w:pPr>
         <w:pStyle w:val="Heading2"/>
       </w:pPr>
+      <w:r>
+        <w:rPr>
+          <w:rStyle w:val="SectionNumber"/>
+        </w:rPr>
+        <w:t xml:space="preserve">10.1</w:t>
+      </w:r>
+      <w:r>
+        <w:tab/>
+      </w:r>
       <w:r>
         <w:t xml:space="preserve">APÊNDICE A — Guião de Tarefas para Testes de Usabilidade</w:t>
       </w:r>
@@ -15043,6 +15582,15 @@
         <w:pStyle w:val="Heading2"/>
       </w:pPr>
       <w:r>
+        <w:rPr>
+          <w:rStyle w:val="SectionNumber"/>
+        </w:rPr>
+        <w:t xml:space="preserve">10.2</w:t>
+      </w:r>
+      <w:r>
+        <w:tab/>
+      </w:r>
+      <w:r>
         <w:t xml:space="preserve">APÊNDICE B — Questionário de Satisfação Pós-Teste</w:t>
       </w:r>
     </w:p>
@@ -15104,6 +15652,15 @@
       <w:pPr>
         <w:pStyle w:val="Heading3"/>
       </w:pPr>
+      <w:r>
+        <w:rPr>
+          <w:rStyle w:val="SectionNumber"/>
+        </w:rPr>
+        <w:t xml:space="preserve">10.2.1</w:t>
+      </w:r>
+      <w:r>
+        <w:tab/>
+      </w:r>
       <w:r>
         <w:rPr>
           <w:b/>
@@ -15145,6 +15702,15 @@
       </w:pPr>
       <w:r>
         <w:rPr>
+          <w:rStyle w:val="SectionNumber"/>
+        </w:rPr>
+        <w:t xml:space="preserve">10.2.2</w:t>
+      </w:r>
+      <w:r>
+        <w:tab/>
+      </w:r>
+      <w:r>
+        <w:rPr>
           <w:b/>
           <w:bCs/>
         </w:rPr>
@@ -15300,6 +15866,15 @@
       </w:pPr>
       <w:r>
         <w:rPr>
+          <w:rStyle w:val="SectionNumber"/>
+        </w:rPr>
+        <w:t xml:space="preserve">10.2.3</w:t>
+      </w:r>
+      <w:r>
+        <w:tab/>
+      </w:r>
+      <w:r>
+        <w:rPr>
           <w:b/>
           <w:bCs/>
         </w:rPr>
@@ -15361,6 +15936,15 @@
       <w:pPr>
         <w:pStyle w:val="Heading3"/>
       </w:pPr>
+      <w:r>
+        <w:rPr>
+          <w:rStyle w:val="SectionNumber"/>
+        </w:rPr>
+        <w:t xml:space="preserve">10.2.4</w:t>
+      </w:r>
+      <w:r>
+        <w:tab/>
+      </w:r>
       <w:r>
         <w:rPr>
           <w:b/>
@@ -16878,7 +17462,7 @@
       <w:color w:themeColor="accent1" w:themeShade="BF" w:val="365F91"/>
     </w:rPr>
   </w:style>
-  <w:style w:customStyle="1" w:styleId="SourceCode" w:type="paragraph">
+  <w:style w:type="paragraph" w:customStyle="1" w:styleId="SourceCode">
     <w:name w:val="Source Code"/>
     <w:basedOn w:val="Normal"/>
     <w:link w:val="VerbatimChar"/>
@@ -16886,7 +17470,7 @@
       <w:wordWrap w:val="off"/>
     </w:pPr>
   </w:style>
-  <w:style w:customStyle="1" w:styleId="KeywordTok" w:type="character">
+  <w:style w:type="character" w:customStyle="1" w:styleId="KeywordTok">
     <w:name w:val="KeywordTok"/>
     <w:basedOn w:val="VerbatimChar"/>
     <w:rPr>
@@ -16894,77 +17478,77 @@
       <w:color w:val="007020"/>
     </w:rPr>
   </w:style>
-  <w:style w:customStyle="1" w:styleId="DataTypeTok" w:type="character">
+  <w:style w:type="character" w:customStyle="1" w:styleId="DataTypeTok">
     <w:name w:val="DataTypeTok"/>
     <w:basedOn w:val="VerbatimChar"/>
     <w:rPr>
       <w:color w:val="902000"/>
     </w:rPr>
   </w:style>
-  <w:style w:customStyle="1" w:styleId="DecValTok" w:type="character">
+  <w:style w:type="character" w:customStyle="1" w:styleId="DecValTok">
     <w:name w:val="DecValTok"/>
     <w:basedOn w:val="VerbatimChar"/>
     <w:rPr>
       <w:color w:val="40a070"/>
     </w:rPr>
   </w:style>
-  <w:style w:customStyle="1" w:styleId="BaseNTok" w:type="character">
+  <w:style w:type="character" w:customStyle="1" w:styleId="BaseNTok">
     <w:name w:val="BaseNTok"/>
     <w:basedOn w:val="VerbatimChar"/>
     <w:rPr>
       <w:color w:val="40a070"/>
     </w:rPr>
   </w:style>
-  <w:style w:customStyle="1" w:styleId="FloatTok" w:type="character">
+  <w:style w:type="character" w:customStyle="1" w:styleId="FloatTok">
     <w:name w:val="FloatTok"/>
     <w:basedOn w:val="VerbatimChar"/>
     <w:rPr>
       <w:color w:val="40a070"/>
     </w:rPr>
   </w:style>
-  <w:style w:customStyle="1" w:styleId="ConstantTok" w:type="character">
+  <w:style w:type="character" w:customStyle="1" w:styleId="ConstantTok">
     <w:name w:val="ConstantTok"/>
     <w:basedOn w:val="VerbatimChar"/>
     <w:rPr>
       <w:color w:val="880000"/>
     </w:rPr>
   </w:style>
-  <w:style w:customStyle="1" w:styleId="CharTok" w:type="character">
+  <w:style w:type="character" w:customStyle="1" w:styleId="CharTok">
     <w:name w:val="CharTok"/>
     <w:basedOn w:val="VerbatimChar"/>
     <w:rPr>
       <w:color w:val="4070a0"/>
     </w:rPr>
   </w:style>
-  <w:style w:customStyle="1" w:styleId="SpecialCharTok" w:type="character">
+  <w:style w:type="character" w:customStyle="1" w:styleId="SpecialCharTok">
     <w:name w:val="SpecialCharTok"/>
     <w:basedOn w:val="VerbatimChar"/>
     <w:rPr>
       <w:color w:val="4070a0"/>
     </w:rPr>
   </w:style>
-  <w:style w:customStyle="1" w:styleId="StringTok" w:type="character">
+  <w:style w:type="character" w:customStyle="1" w:styleId="StringTok">
     <w:name w:val="StringTok"/>
     <w:basedOn w:val="VerbatimChar"/>
     <w:rPr>
       <w:color w:val="4070a0"/>
     </w:rPr>
   </w:style>
-  <w:style w:customStyle="1" w:styleId="VerbatimStringTok" w:type="character">
+  <w:style w:type="character" w:customStyle="1" w:styleId="VerbatimStringTok">
     <w:name w:val="VerbatimStringTok"/>
     <w:basedOn w:val="VerbatimChar"/>
     <w:rPr>
       <w:color w:val="4070a0"/>
     </w:rPr>
   </w:style>
-  <w:style w:customStyle="1" w:styleId="SpecialStringTok" w:type="character">
+  <w:style w:type="character" w:customStyle="1" w:styleId="SpecialStringTok">
     <w:name w:val="SpecialStringTok"/>
     <w:basedOn w:val="VerbatimChar"/>
     <w:rPr>
       <w:color w:val="bb6688"/>
     </w:rPr>
   </w:style>
-  <w:style w:customStyle="1" w:styleId="ImportTok" w:type="character">
+  <w:style w:type="character" w:customStyle="1" w:styleId="ImportTok">
     <w:name w:val="ImportTok"/>
     <w:basedOn w:val="VerbatimChar"/>
     <w:rPr>
@@ -16972,7 +17556,7 @@
       <w:color w:val="008000"/>
     </w:rPr>
   </w:style>
-  <w:style w:customStyle="1" w:styleId="CommentTok" w:type="character">
+  <w:style w:type="character" w:customStyle="1" w:styleId="CommentTok">
     <w:name w:val="CommentTok"/>
     <w:basedOn w:val="VerbatimChar"/>
     <w:rPr>
@@ -16980,7 +17564,7 @@
       <w:color w:val="60a0b0"/>
     </w:rPr>
   </w:style>
-  <w:style w:customStyle="1" w:styleId="DocumentationTok" w:type="character">
+  <w:style w:type="character" w:customStyle="1" w:styleId="DocumentationTok">
     <w:name w:val="DocumentationTok"/>
     <w:basedOn w:val="VerbatimChar"/>
     <w:rPr>
@@ -16988,7 +17572,7 @@
       <w:color w:val="ba2121"/>
     </w:rPr>
   </w:style>
-  <w:style w:customStyle="1" w:styleId="AnnotationTok" w:type="character">
+  <w:style w:type="character" w:customStyle="1" w:styleId="AnnotationTok">
     <w:name w:val="AnnotationTok"/>
     <w:basedOn w:val="VerbatimChar"/>
     <w:rPr>
@@ -16997,7 +17581,7 @@
       <w:color w:val="60a0b0"/>
     </w:rPr>
   </w:style>
-  <w:style w:customStyle="1" w:styleId="CommentVarTok" w:type="character">
+  <w:style w:type="character" w:customStyle="1" w:styleId="CommentVarTok">
     <w:name w:val="CommentVarTok"/>
     <w:basedOn w:val="VerbatimChar"/>
     <w:rPr>
@@ -17006,28 +17590,28 @@
       <w:color w:val="60a0b0"/>
     </w:rPr>
   </w:style>
-  <w:style w:customStyle="1" w:styleId="OtherTok" w:type="character">
+  <w:style w:type="character" w:customStyle="1" w:styleId="OtherTok">
     <w:name w:val="OtherTok"/>
     <w:basedOn w:val="VerbatimChar"/>
     <w:rPr>
       <w:color w:val="007020"/>
     </w:rPr>
   </w:style>
-  <w:style w:customStyle="1" w:styleId="FunctionTok" w:type="character">
+  <w:style w:type="character" w:customStyle="1" w:styleId="FunctionTok">
     <w:name w:val="FunctionTok"/>
     <w:basedOn w:val="VerbatimChar"/>
     <w:rPr>
       <w:color w:val="06287e"/>
     </w:rPr>
   </w:style>
-  <w:style w:customStyle="1" w:styleId="VariableTok" w:type="character">
+  <w:style w:type="character" w:customStyle="1" w:styleId="VariableTok">
     <w:name w:val="VariableTok"/>
     <w:basedOn w:val="VerbatimChar"/>
     <w:rPr>
       <w:color w:val="19177c"/>
     </w:rPr>
   </w:style>
-  <w:style w:customStyle="1" w:styleId="ControlFlowTok" w:type="character">
+  <w:style w:type="character" w:customStyle="1" w:styleId="ControlFlowTok">
     <w:name w:val="ControlFlowTok"/>
     <w:basedOn w:val="VerbatimChar"/>
     <w:rPr>
@@ -17035,45 +17619,45 @@
       <w:color w:val="007020"/>
     </w:rPr>
   </w:style>
-  <w:style w:customStyle="1" w:styleId="OperatorTok" w:type="character">
+  <w:style w:type="character" w:customStyle="1" w:styleId="OperatorTok">
     <w:name w:val="OperatorTok"/>
     <w:basedOn w:val="VerbatimChar"/>
     <w:rPr>
       <w:color w:val="666666"/>
     </w:rPr>
   </w:style>
-  <w:style w:customStyle="1" w:styleId="BuiltInTok" w:type="character">
+  <w:style w:type="character" w:customStyle="1" w:styleId="BuiltInTok">
     <w:name w:val="BuiltInTok"/>
     <w:basedOn w:val="VerbatimChar"/>
     <w:rPr>
       <w:color w:val="008000"/>
     </w:rPr>
   </w:style>
-  <w:style w:customStyle="1" w:styleId="ExtensionTok" w:type="character">
+  <w:style w:type="character" w:customStyle="1" w:styleId="ExtensionTok">
     <w:name w:val="ExtensionTok"/>
     <w:basedOn w:val="VerbatimChar"/>
     <w:rPr/>
   </w:style>
-  <w:style w:customStyle="1" w:styleId="PreprocessorTok" w:type="character">
+  <w:style w:type="character" w:customStyle="1" w:styleId="PreprocessorTok">
     <w:name w:val="PreprocessorTok"/>
     <w:basedOn w:val="VerbatimChar"/>
     <w:rPr>
       <w:color w:val="bc7a00"/>
     </w:rPr>
   </w:style>
-  <w:style w:customStyle="1" w:styleId="AttributeTok" w:type="character">
+  <w:style w:type="character" w:customStyle="1" w:styleId="AttributeTok">
     <w:name w:val="AttributeTok"/>
     <w:basedOn w:val="VerbatimChar"/>
     <w:rPr>
       <w:color w:val="7d9029"/>
     </w:rPr>
   </w:style>
-  <w:style w:customStyle="1" w:styleId="RegionMarkerTok" w:type="character">
+  <w:style w:type="character" w:customStyle="1" w:styleId="RegionMarkerTok">
     <w:name w:val="RegionMarkerTok"/>
     <w:basedOn w:val="VerbatimChar"/>
     <w:rPr/>
   </w:style>
-  <w:style w:customStyle="1" w:styleId="InformationTok" w:type="character">
+  <w:style w:type="character" w:customStyle="1" w:styleId="InformationTok">
     <w:name w:val="InformationTok"/>
     <w:basedOn w:val="VerbatimChar"/>
     <w:rPr>
@@ -17082,7 +17666,7 @@
       <w:color w:val="60a0b0"/>
     </w:rPr>
   </w:style>
-  <w:style w:customStyle="1" w:styleId="WarningTok" w:type="character">
+  <w:style w:type="character" w:customStyle="1" w:styleId="WarningTok">
     <w:name w:val="WarningTok"/>
     <w:basedOn w:val="VerbatimChar"/>
     <w:rPr>
@@ -17091,7 +17675,7 @@
       <w:color w:val="60a0b0"/>
     </w:rPr>
   </w:style>
-  <w:style w:customStyle="1" w:styleId="AlertTok" w:type="character">
+  <w:style w:type="character" w:customStyle="1" w:styleId="AlertTok">
     <w:name w:val="AlertTok"/>
     <w:basedOn w:val="VerbatimChar"/>
     <w:rPr>
@@ -17099,7 +17683,7 @@
       <w:color w:val="ff0000"/>
     </w:rPr>
   </w:style>
-  <w:style w:customStyle="1" w:styleId="ErrorTok" w:type="character">
+  <w:style w:type="character" w:customStyle="1" w:styleId="ErrorTok">
     <w:name w:val="ErrorTok"/>
     <w:basedOn w:val="VerbatimChar"/>
     <w:rPr>
@@ -17107,7 +17691,7 @@
       <w:color w:val="ff0000"/>
     </w:rPr>
   </w:style>
-  <w:style w:customStyle="1" w:styleId="NormalTok" w:type="character">
+  <w:style w:type="character" w:customStyle="1" w:styleId="NormalTok">
     <w:name w:val="NormalTok"/>
     <w:basedOn w:val="VerbatimChar"/>
     <w:rPr/>

</xml_diff>